<commit_message>
feat(ressources): banque rangee — accordeons par niveau, tuiles par discipline
- Accordeons <details> par niveau, classes automatiquement de la 6e a la
  Terminale (reconnaissance tolerante : Sixieme/6e, Seconde/2nde, Tle...,
  inconnus apres, « Tous niveaux » en dernier) ; premier niveau ouvert,
  compteurs ressources/disciplines dans l'en-tete
- Dans chaque niveau : tuiles par discipline ; dans chaque tuile, les
  clips (lecteur, taille, Plein ecran, bouton Chanson & quiz)
- Migration additive n°11 appliquee : colonne discipline + remplissage
  (Troisieme -> Physique-Chimie x6, Sixieme -> SVT x2)
- Admin : champ Discipline (avec suggestions des disciplines existantes),
  colonne dans le tableau, modification incluse
- Guide Admin actualise (6 guides regeneres)
- Verifie 13/13 + accordeon reellement clique dans le navigateur

Co-Authored-By: Claude Fable 5 <noreply@anthropic.com>
</commit_message>
<xml_diff>
--- a/guides/Guide-Admin-EduWeb.docx
+++ b/guides/Guide-Admin-EduWeb.docx
@@ -109,7 +109,7 @@
           <w:sz w:val="16"/>
           <w:szCs w:val="16"/>
         </w:rPr>
-        <w:t xml:space="preserve">family.eduweb.ci · Version du 7 septembre 2026</w:t>
+        <w:t xml:space="preserve">family.eduweb.ci · Version du 26 septembre 2026</w:t>
       </w:r>
     </w:p>
     <w:p>
@@ -2229,7 +2229,7 @@
           <w:sz w:val="22"/>
           <w:szCs w:val="22"/>
         </w:rPr>
-        <w:t xml:space="preserve">« Ajouter une ressource » : titre, NIVEAU (c'est lui qui crée les sections d'affichage — « Troisième », « Terminale C », « Tous niveaux »…), description, ordre.</w:t>
+        <w:t xml:space="preserve">« Ajouter une ressource » : titre, NIVEAU (l'accordéon d'affichage — les niveaux sont automatiquement classés de la Sixième à la Terminale), DISCIPLINE (la tuile à l'intérieur du niveau : SVT, Physique-Chimie… — le champ propose les disciplines déjà utilisées), description, ordre.</w:t>
       </w:r>
     </w:p>
     <w:p>

</xml_diff>

<commit_message>
feat(ressources): compteurs de consultations/telechargements par ressource + frequentation de la banque
- Migration additive n° 12 (scripts/migrate-ressources-stats.js) : RessourceDidactique.vues,
  RessourceDidactique.telechargements, SiteStat.ressourcesVisites
- /ressources : entete avec visites de la banque (1 par visiteur et par demi-heure),
  cumul des consultations et des telechargements ; chaque carte affiche ses compteurs
- Comptage par balise navigateur (POST /ressources/:id/stat/vue|telechargement, 204,
  1 par minute par visiteur et ressource) : premiere lecture du media, Plein ecran/Ouvrir,
  Telecharger ; mise a jour immediate du compteur affiche
- Videos : bouton Telecharger dedie (?download=1 sur Vercel Blob) distinct de Plein ecran
- Page chant : la lecture du clip venant de la banque compte pour la ressource
- Admin ressources : bandeau de frequentation + colonne par ressource ; guide Admin mis a jour

Co-Authored-By: Claude Fable 5.1 <noreply@anthropic.com>
</commit_message>
<xml_diff>
--- a/guides/Guide-Admin-EduWeb.docx
+++ b/guides/Guide-Admin-EduWeb.docx
@@ -109,7 +109,7 @@
           <w:sz w:val="16"/>
           <w:szCs w:val="16"/>
         </w:rPr>
-        <w:t xml:space="preserve">family.eduweb.ci · Version du 26 septembre 2026</w:t>
+        <w:t xml:space="preserve">family.eduweb.ci · Version du 28 septembre 2026</w:t>
       </w:r>
     </w:p>
     <w:p>
@@ -214,8 +214,8 @@
       <w:pPr>
         <w:pBdr>
           <w:top w:val="single" w:color="EAF3FB" w:sz="2" w:space="6"/>
+          <w:left w:val="single" w:color="2A77C6" w:sz="18" w:space="10"/>
           <w:bottom w:val="single" w:color="EAF3FB" w:sz="2" w:space="6"/>
-          <w:left w:val="single" w:color="2A77C6" w:sz="18" w:space="10"/>
           <w:right w:val="single" w:color="EAF3FB" w:sz="2" w:space="6"/>
         </w:pBdr>
         <w:shd w:fill="EAF3FB" w:color="auto" w:val="clear"/>
@@ -540,8 +540,8 @@
       <w:pPr>
         <w:pBdr>
           <w:top w:val="single" w:color="FDF3E6" w:sz="2" w:space="6"/>
+          <w:left w:val="single" w:color="C9871C" w:sz="18" w:space="10"/>
           <w:bottom w:val="single" w:color="FDF3E6" w:sz="2" w:space="6"/>
-          <w:left w:val="single" w:color="C9871C" w:sz="18" w:space="10"/>
           <w:right w:val="single" w:color="FDF3E6" w:sz="2" w:space="6"/>
         </w:pBdr>
         <w:shd w:fill="FDF3E6" w:color="auto" w:val="clear"/>
@@ -570,8 +570,8 @@
       <w:pPr>
         <w:pBdr>
           <w:top w:val="single" w:color="E8F5EC" w:sz="2" w:space="6"/>
+          <w:left w:val="single" w:color="1E9E57" w:sz="18" w:space="10"/>
           <w:bottom w:val="single" w:color="E8F5EC" w:sz="2" w:space="6"/>
-          <w:left w:val="single" w:color="1E9E57" w:sz="18" w:space="10"/>
           <w:right w:val="single" w:color="E8F5EC" w:sz="2" w:space="6"/>
         </w:pBdr>
         <w:shd w:fill="E8F5EC" w:color="auto" w:val="clear"/>
@@ -731,8 +731,8 @@
       <w:pPr>
         <w:pBdr>
           <w:top w:val="single" w:color="EAF3FB" w:sz="2" w:space="6"/>
+          <w:left w:val="single" w:color="2A77C6" w:sz="18" w:space="10"/>
           <w:bottom w:val="single" w:color="EAF3FB" w:sz="2" w:space="6"/>
-          <w:left w:val="single" w:color="2A77C6" w:sz="18" w:space="10"/>
           <w:right w:val="single" w:color="EAF3FB" w:sz="2" w:space="6"/>
         </w:pBdr>
         <w:shd w:fill="EAF3FB" w:color="auto" w:val="clear"/>
@@ -950,8 +950,8 @@
       <w:pPr>
         <w:pBdr>
           <w:top w:val="single" w:color="E8F5EC" w:sz="2" w:space="6"/>
+          <w:left w:val="single" w:color="1E9E57" w:sz="18" w:space="10"/>
           <w:bottom w:val="single" w:color="E8F5EC" w:sz="2" w:space="6"/>
-          <w:left w:val="single" w:color="1E9E57" w:sz="18" w:space="10"/>
           <w:right w:val="single" w:color="E8F5EC" w:sz="2" w:space="6"/>
         </w:pBdr>
         <w:shd w:fill="E8F5EC" w:color="auto" w:val="clear"/>
@@ -1054,8 +1054,8 @@
       <w:pPr>
         <w:pBdr>
           <w:top w:val="single" w:color="EAF3FB" w:sz="2" w:space="6"/>
+          <w:left w:val="single" w:color="2A77C6" w:sz="18" w:space="10"/>
           <w:bottom w:val="single" w:color="EAF3FB" w:sz="2" w:space="6"/>
-          <w:left w:val="single" w:color="2A77C6" w:sz="18" w:space="10"/>
           <w:right w:val="single" w:color="EAF3FB" w:sz="2" w:space="6"/>
         </w:pBdr>
         <w:shd w:fill="EAF3FB" w:color="auto" w:val="clear"/>
@@ -1217,8 +1217,8 @@
       <w:pPr>
         <w:pBdr>
           <w:top w:val="single" w:color="E8F5EC" w:sz="2" w:space="6"/>
+          <w:left w:val="single" w:color="1E9E57" w:sz="18" w:space="10"/>
           <w:bottom w:val="single" w:color="E8F5EC" w:sz="2" w:space="6"/>
-          <w:left w:val="single" w:color="1E9E57" w:sz="18" w:space="10"/>
           <w:right w:val="single" w:color="E8F5EC" w:sz="2" w:space="6"/>
         </w:pBdr>
         <w:shd w:fill="E8F5EC" w:color="auto" w:val="clear"/>
@@ -1420,8 +1420,8 @@
       <w:pPr>
         <w:pBdr>
           <w:top w:val="single" w:color="E8F5EC" w:sz="2" w:space="6"/>
+          <w:left w:val="single" w:color="1E9E57" w:sz="18" w:space="10"/>
           <w:bottom w:val="single" w:color="E8F5EC" w:sz="2" w:space="6"/>
-          <w:left w:val="single" w:color="1E9E57" w:sz="18" w:space="10"/>
           <w:right w:val="single" w:color="E8F5EC" w:sz="2" w:space="6"/>
         </w:pBdr>
         <w:shd w:fill="E8F5EC" w:color="auto" w:val="clear"/>
@@ -1526,8 +1526,8 @@
       <w:pPr>
         <w:pBdr>
           <w:top w:val="single" w:color="FDF3E6" w:sz="2" w:space="6"/>
+          <w:left w:val="single" w:color="C9871C" w:sz="18" w:space="10"/>
           <w:bottom w:val="single" w:color="FDF3E6" w:sz="2" w:space="6"/>
-          <w:left w:val="single" w:color="C9871C" w:sz="18" w:space="10"/>
           <w:right w:val="single" w:color="FDF3E6" w:sz="2" w:space="6"/>
         </w:pBdr>
         <w:shd w:fill="FDF3E6" w:color="auto" w:val="clear"/>
@@ -1669,8 +1669,8 @@
       <w:pPr>
         <w:pBdr>
           <w:top w:val="single" w:color="E8F5EC" w:sz="2" w:space="6"/>
+          <w:left w:val="single" w:color="1E9E57" w:sz="18" w:space="10"/>
           <w:bottom w:val="single" w:color="E8F5EC" w:sz="2" w:space="6"/>
-          <w:left w:val="single" w:color="1E9E57" w:sz="18" w:space="10"/>
           <w:right w:val="single" w:color="E8F5EC" w:sz="2" w:space="6"/>
         </w:pBdr>
         <w:shd w:fill="E8F5EC" w:color="auto" w:val="clear"/>
@@ -2102,8 +2102,8 @@
       <w:pPr>
         <w:pBdr>
           <w:top w:val="single" w:color="E8F5EC" w:sz="2" w:space="6"/>
+          <w:left w:val="single" w:color="1E9E57" w:sz="18" w:space="10"/>
           <w:bottom w:val="single" w:color="E8F5EC" w:sz="2" w:space="6"/>
-          <w:left w:val="single" w:color="1E9E57" w:sz="18" w:space="10"/>
           <w:right w:val="single" w:color="E8F5EC" w:sz="2" w:space="6"/>
         </w:pBdr>
         <w:shd w:fill="E8F5EC" w:color="auto" w:val="clear"/>
@@ -2280,6 +2280,23 @@
           <w:sz w:val="22"/>
           <w:szCs w:val="22"/>
         </w:rPr>
+        <w:t xml:space="preserve">FRÉQUENTATION : chaque ressource affiche son nombre de consultations (lectures du média, ouvertures « Plein écran / Ouvrir ») et de téléchargements ; l'entête de la banque totalise les visites de la page (une par visiteur et par demi-heure), les consultations et les téléchargements. Les mêmes chiffres apparaissent dans le tableau « Ressources (admin) ».</w:t>
+      </w:r>
+    </w:p>
+    <w:p>
+      <w:pPr>
+        <w:pStyle w:val="ListParagraph"/>
+        <w:numPr>
+          <w:ilvl w:val="0"/>
+          <w:numId w:val="13"/>
+        </w:numPr>
+        <w:spacing w:after="40"/>
+      </w:pPr>
+      <w:r>
+        <w:rPr>
+          <w:sz w:val="22"/>
+          <w:szCs w:val="22"/>
+        </w:rPr>
         <w:t xml:space="preserve">« Masquer » retire une ressource du public sans la supprimer ; « Supprimer » efface aussi le fichier hébergé.</w:t>
       </w:r>
     </w:p>
@@ -2346,8 +2363,8 @@
       <w:pPr>
         <w:pBdr>
           <w:top w:val="single" w:color="E8F5EC" w:sz="2" w:space="6"/>
+          <w:left w:val="single" w:color="1E9E57" w:sz="18" w:space="10"/>
           <w:bottom w:val="single" w:color="E8F5EC" w:sz="2" w:space="6"/>
-          <w:left w:val="single" w:color="1E9E57" w:sz="18" w:space="10"/>
           <w:right w:val="single" w:color="E8F5EC" w:sz="2" w:space="6"/>
         </w:pBdr>
         <w:shd w:fill="E8F5EC" w:color="auto" w:val="clear"/>
@@ -2373,7 +2390,7 @@
       </w:r>
     </w:p>
     <w:sectPr>
-      <w:footerReference w:type="default" r:id="rId7"/>
+      <w:footerReference w:type="default" r:id="rId6"/>
       <w:pgSz w:w="11906" w:h="16838" w:orient="portrait"/>
       <w:pgMar w:top="1440" w:right="1440" w:bottom="1440" w:left="1440" w:header="708" w:footer="708" w:gutter="0"/>
       <w:pgNumType/>
@@ -2381,10 +2398,6 @@
     </w:sectPr>
   </w:body>
 </w:document>
-</file>
-
-<file path=word/comments.xml><?xml version="1.0" encoding="utf-8"?>
-<w:comments xmlns:cx="http://schemas.microsoft.com/office/drawing/2014/chartex" xmlns:cx1="http://schemas.microsoft.com/office/drawing/2015/9/8/chartex" xmlns:cx2="http://schemas.microsoft.com/office/drawing/2015/10/21/chartex" xmlns:cx3="http://schemas.microsoft.com/office/drawing/2016/5/9/chartex" xmlns:cx4="http://schemas.microsoft.com/office/drawing/2016/5/10/chartex" xmlns:cx5="http://schemas.microsoft.com/office/drawing/2016/5/11/chartex" xmlns:cx6="http://schemas.microsoft.com/office/drawing/2016/5/12/chartex" xmlns:cx7="http://schemas.microsoft.com/office/drawing/2016/5/13/chartex" xmlns:cx8="http://schemas.microsoft.com/office/drawing/2016/5/14/chartex" xmlns:mc="http://schemas.openxmlformats.org/markup-compatibility/2006" xmlns:aink="http://schemas.microsoft.com/office/drawing/2016/ink" xmlns:am3d="http://schemas.microsoft.com/office/drawing/2017/model3d" xmlns:o="urn:schemas-microsoft-com:office:office" xmlns:r="http://schemas.openxmlformats.org/officeDocument/2006/relationships" xmlns:m="http://schemas.openxmlformats.org/officeDocument/2006/math" xmlns:v="urn:schemas-microsoft-com:vml" xmlns:wp14="http://schemas.microsoft.com/office/word/2010/wordprocessingDrawing" xmlns:wp="http://schemas.openxmlformats.org/drawingml/2006/wordprocessingDrawing" xmlns:w10="urn:schemas-microsoft-com:office:word" xmlns:w="http://schemas.openxmlformats.org/wordprocessingml/2006/main" xmlns:w14="http://schemas.microsoft.com/office/word/2010/wordml" xmlns:w15="http://schemas.microsoft.com/office/word/2012/wordml" xmlns:w16cex="http://schemas.microsoft.com/office/word/2018/wordml/cex" xmlns:w16cid="http://schemas.microsoft.com/office/word/2016/wordml/cid" xmlns:w16="http://schemas.microsoft.com/office/word/2018/wordml" xmlns:w16sdtdh="http://schemas.microsoft.com/office/word/2020/wordml/sdtdatahash" xmlns:w16se="http://schemas.microsoft.com/office/word/2015/wordml/symex" xmlns:wpg="http://schemas.microsoft.com/office/word/2010/wordprocessingGroup" xmlns:wpi="http://schemas.microsoft.com/office/word/2010/wordprocessingInk" xmlns:wne="http://schemas.microsoft.com/office/word/2006/wordml" xmlns:wps="http://schemas.microsoft.com/office/word/2010/wordprocessingShape"/>
 </file>
 
 <file path=word/endnotes.xml><?xml version="1.0" encoding="utf-8"?>
@@ -2526,7 +2539,7 @@
 <w:numbering xmlns:wpc="http://schemas.microsoft.com/office/word/2010/wordprocessingCanvas" xmlns:mc="http://schemas.openxmlformats.org/markup-compatibility/2006" xmlns:o="urn:schemas-microsoft-com:office:office" xmlns:r="http://schemas.openxmlformats.org/officeDocument/2006/relationships" xmlns:m="http://schemas.openxmlformats.org/officeDocument/2006/math" xmlns:v="urn:schemas-microsoft-com:vml" xmlns:wp14="http://schemas.microsoft.com/office/word/2010/wordprocessingDrawing" xmlns:wp="http://schemas.openxmlformats.org/drawingml/2006/wordprocessingDrawing" xmlns:w10="urn:schemas-microsoft-com:office:word" xmlns:w="http://schemas.openxmlformats.org/wordprocessingml/2006/main" xmlns:w14="http://schemas.microsoft.com/office/word/2010/wordml" xmlns:w15="http://schemas.microsoft.com/office/word/2012/wordml" xmlns:wpg="http://schemas.microsoft.com/office/word/2010/wordprocessingGroup" xmlns:wpi="http://schemas.microsoft.com/office/word/2010/wordprocessingInk" xmlns:wne="http://schemas.microsoft.com/office/word/2006/wordml" xmlns:wps="http://schemas.microsoft.com/office/word/2010/wordprocessingShape" mc:Ignorable="w14 w15 wp14">
   <w:abstractNum w:abstractNumId="1" w15:restartNumberingAfterBreak="0">
     <w:multiLevelType w:val="hybridMultilevel"/>
-    <w:lvl w:ilvl="0" w15:tentative="1">
+    <w:lvl w:ilvl="0" w:tentative="1">
       <w:start w:val="1"/>
       <w:numFmt w:val="bullet"/>
       <w:lvlText w:val="●"/>
@@ -2535,7 +2548,7 @@
         <w:ind w:left="720" w:hanging="360"/>
       </w:pPr>
     </w:lvl>
-    <w:lvl w:ilvl="1" w15:tentative="1">
+    <w:lvl w:ilvl="1" w:tentative="1">
       <w:start w:val="1"/>
       <w:numFmt w:val="bullet"/>
       <w:lvlText w:val="○"/>
@@ -2544,7 +2557,7 @@
         <w:ind w:left="1440" w:hanging="360"/>
       </w:pPr>
     </w:lvl>
-    <w:lvl w:ilvl="2" w15:tentative="1">
+    <w:lvl w:ilvl="2" w:tentative="1">
       <w:start w:val="1"/>
       <w:numFmt w:val="bullet"/>
       <w:lvlText w:val="■"/>
@@ -2553,7 +2566,7 @@
         <w:ind w:left="2160" w:hanging="360"/>
       </w:pPr>
     </w:lvl>
-    <w:lvl w:ilvl="3" w15:tentative="1">
+    <w:lvl w:ilvl="3" w:tentative="1">
       <w:start w:val="1"/>
       <w:numFmt w:val="bullet"/>
       <w:lvlText w:val="●"/>
@@ -2562,7 +2575,7 @@
         <w:ind w:left="2880" w:hanging="360"/>
       </w:pPr>
     </w:lvl>
-    <w:lvl w:ilvl="4" w15:tentative="1">
+    <w:lvl w:ilvl="4" w:tentative="1">
       <w:start w:val="1"/>
       <w:numFmt w:val="bullet"/>
       <w:lvlText w:val="○"/>
@@ -2571,7 +2584,7 @@
         <w:ind w:left="3600" w:hanging="360"/>
       </w:pPr>
     </w:lvl>
-    <w:lvl w:ilvl="5" w15:tentative="1">
+    <w:lvl w:ilvl="5" w:tentative="1">
       <w:start w:val="1"/>
       <w:numFmt w:val="bullet"/>
       <w:lvlText w:val="■"/>
@@ -2580,7 +2593,7 @@
         <w:ind w:left="4320" w:hanging="360"/>
       </w:pPr>
     </w:lvl>
-    <w:lvl w:ilvl="6" w15:tentative="1">
+    <w:lvl w:ilvl="6" w:tentative="1">
       <w:start w:val="1"/>
       <w:numFmt w:val="bullet"/>
       <w:lvlText w:val="●"/>
@@ -2589,7 +2602,7 @@
         <w:ind w:left="5040" w:hanging="360"/>
       </w:pPr>
     </w:lvl>
-    <w:lvl w:ilvl="7" w15:tentative="1">
+    <w:lvl w:ilvl="7" w:tentative="1">
       <w:start w:val="1"/>
       <w:numFmt w:val="bullet"/>
       <w:lvlText w:val="●"/>
@@ -2598,7 +2611,7 @@
         <w:ind w:left="5760" w:hanging="360"/>
       </w:pPr>
     </w:lvl>
-    <w:lvl w:ilvl="8" w15:tentative="1">
+    <w:lvl w:ilvl="8" w:tentative="1">
       <w:start w:val="1"/>
       <w:numFmt w:val="bullet"/>
       <w:lvlText w:val="●"/>
@@ -2610,7 +2623,7 @@
   </w:abstractNum>
   <w:abstractNum w:abstractNumId="2" w15:restartNumberingAfterBreak="0">
     <w:multiLevelType w:val="hybridMultilevel"/>
-    <w:lvl w:ilvl="0" w15:tentative="1">
+    <w:lvl w:ilvl="0" w:tentative="1">
       <w:start w:val="1"/>
       <w:numFmt w:val="bullet"/>
       <w:lvlText w:val="•"/>
@@ -2622,7 +2635,7 @@
   </w:abstractNum>
   <w:abstractNum w:abstractNumId="3" w15:restartNumberingAfterBreak="0">
     <w:multiLevelType w:val="hybridMultilevel"/>
-    <w:lvl w:ilvl="0" w15:tentative="1">
+    <w:lvl w:ilvl="0" w:tentative="1">
       <w:start w:val="1"/>
       <w:numFmt w:val="decimal"/>
       <w:lvlText w:val="%1."/>
@@ -2634,7 +2647,7 @@
   </w:abstractNum>
   <w:abstractNum w:abstractNumId="4" w15:restartNumberingAfterBreak="0">
     <w:multiLevelType w:val="hybridMultilevel"/>
-    <w:lvl w:ilvl="0" w15:tentative="1">
+    <w:lvl w:ilvl="0" w:tentative="1">
       <w:start w:val="1"/>
       <w:numFmt w:val="decimal"/>
       <w:lvlText w:val="%1."/>
@@ -2646,7 +2659,7 @@
   </w:abstractNum>
   <w:abstractNum w:abstractNumId="5" w15:restartNumberingAfterBreak="0">
     <w:multiLevelType w:val="hybridMultilevel"/>
-    <w:lvl w:ilvl="0" w15:tentative="1">
+    <w:lvl w:ilvl="0" w:tentative="1">
       <w:start w:val="1"/>
       <w:numFmt w:val="decimal"/>
       <w:lvlText w:val="%1."/>
@@ -2658,7 +2671,7 @@
   </w:abstractNum>
   <w:abstractNum w:abstractNumId="6" w15:restartNumberingAfterBreak="0">
     <w:multiLevelType w:val="hybridMultilevel"/>
-    <w:lvl w:ilvl="0" w15:tentative="1">
+    <w:lvl w:ilvl="0" w:tentative="1">
       <w:start w:val="1"/>
       <w:numFmt w:val="decimal"/>
       <w:lvlText w:val="%1."/>
@@ -2670,7 +2683,7 @@
   </w:abstractNum>
   <w:abstractNum w:abstractNumId="7" w15:restartNumberingAfterBreak="0">
     <w:multiLevelType w:val="hybridMultilevel"/>
-    <w:lvl w:ilvl="0" w15:tentative="1">
+    <w:lvl w:ilvl="0" w:tentative="1">
       <w:start w:val="1"/>
       <w:numFmt w:val="decimal"/>
       <w:lvlText w:val="%1."/>
@@ -2682,7 +2695,7 @@
   </w:abstractNum>
   <w:abstractNum w:abstractNumId="8" w15:restartNumberingAfterBreak="0">
     <w:multiLevelType w:val="hybridMultilevel"/>
-    <w:lvl w:ilvl="0" w15:tentative="1">
+    <w:lvl w:ilvl="0" w:tentative="1">
       <w:start w:val="1"/>
       <w:numFmt w:val="decimal"/>
       <w:lvlText w:val="%1."/>
@@ -2694,7 +2707,7 @@
   </w:abstractNum>
   <w:abstractNum w:abstractNumId="9" w15:restartNumberingAfterBreak="0">
     <w:multiLevelType w:val="hybridMultilevel"/>
-    <w:lvl w:ilvl="0" w15:tentative="1">
+    <w:lvl w:ilvl="0" w:tentative="1">
       <w:start w:val="1"/>
       <w:numFmt w:val="decimal"/>
       <w:lvlText w:val="%1."/>
@@ -2706,7 +2719,7 @@
   </w:abstractNum>
   <w:abstractNum w:abstractNumId="10" w15:restartNumberingAfterBreak="0">
     <w:multiLevelType w:val="hybridMultilevel"/>
-    <w:lvl w:ilvl="0" w15:tentative="1">
+    <w:lvl w:ilvl="0" w:tentative="1">
       <w:start w:val="1"/>
       <w:numFmt w:val="decimal"/>
       <w:lvlText w:val="%1."/>
@@ -2718,7 +2731,7 @@
   </w:abstractNum>
   <w:abstractNum w:abstractNumId="11" w15:restartNumberingAfterBreak="0">
     <w:multiLevelType w:val="hybridMultilevel"/>
-    <w:lvl w:ilvl="0" w15:tentative="1">
+    <w:lvl w:ilvl="0" w:tentative="1">
       <w:start w:val="1"/>
       <w:numFmt w:val="decimal"/>
       <w:lvlText w:val="%1."/>
@@ -2730,7 +2743,7 @@
   </w:abstractNum>
   <w:abstractNum w:abstractNumId="12" w15:restartNumberingAfterBreak="0">
     <w:multiLevelType w:val="hybridMultilevel"/>
-    <w:lvl w:ilvl="0" w15:tentative="1">
+    <w:lvl w:ilvl="0" w:tentative="1">
       <w:start w:val="1"/>
       <w:numFmt w:val="decimal"/>
       <w:lvlText w:val="%1."/>
@@ -2742,7 +2755,7 @@
   </w:abstractNum>
   <w:abstractNum w:abstractNumId="13" w15:restartNumberingAfterBreak="0">
     <w:multiLevelType w:val="hybridMultilevel"/>
-    <w:lvl w:ilvl="0" w15:tentative="1">
+    <w:lvl w:ilvl="0" w:tentative="1">
       <w:start w:val="1"/>
       <w:numFmt w:val="decimal"/>
       <w:lvlText w:val="%1."/>
@@ -2754,7 +2767,7 @@
   </w:abstractNum>
   <w:abstractNum w:abstractNumId="14" w15:restartNumberingAfterBreak="0">
     <w:multiLevelType w:val="hybridMultilevel"/>
-    <w:lvl w:ilvl="0" w15:tentative="1">
+    <w:lvl w:ilvl="0" w:tentative="1">
       <w:start w:val="1"/>
       <w:numFmt w:val="decimal"/>
       <w:lvlText w:val="%1."/>
@@ -2863,6 +2876,10 @@
     </w:rPrDefault>
     <w:pPrDefault/>
   </w:docDefaults>
+  <w:style w:type="paragraph" w:styleId="Normal" w:default="1">
+    <w:name w:val="Normal"/>
+    <w:qFormat/>
+  </w:style>
   <w:style w:type="paragraph" w:styleId="Title">
     <w:name w:val="Title"/>
     <w:basedOn w:val="Normal"/>
@@ -2871,28 +2888,6 @@
     <w:rPr>
       <w:sz w:val="56"/>
       <w:szCs w:val="56"/>
-    </w:rPr>
-  </w:style>
-  <w:style w:type="paragraph" w:styleId="Heading1">
-    <w:name w:val="Heading 1"/>
-    <w:basedOn w:val="Normal"/>
-    <w:next w:val="Normal"/>
-    <w:qFormat/>
-    <w:rPr>
-      <w:color w:val="2E74B5"/>
-      <w:sz w:val="32"/>
-      <w:szCs w:val="32"/>
-    </w:rPr>
-  </w:style>
-  <w:style w:type="paragraph" w:styleId="Heading2">
-    <w:name w:val="Heading 2"/>
-    <w:basedOn w:val="Normal"/>
-    <w:next w:val="Normal"/>
-    <w:qFormat/>
-    <w:rPr>
-      <w:color w:val="2E74B5"/>
-      <w:sz w:val="26"/>
-      <w:szCs w:val="26"/>
     </w:rPr>
   </w:style>
   <w:style w:type="paragraph" w:styleId="Heading3">
@@ -3074,4 +3069,294 @@
     </w:rPr>
   </w:style>
 </w:styles>
+</file>
+
+<file path=word/theme/theme1.xml><?xml version="1.0" encoding="utf-8"?>
+<a:theme xmlns:a="http://schemas.openxmlformats.org/drawingml/2006/main" name="Office Theme">
+  <a:themeElements>
+    <a:clrScheme name="Office">
+      <a:dk1>
+        <a:sysClr val="windowText" lastClr="000000"/>
+      </a:dk1>
+      <a:lt1>
+        <a:sysClr val="window" lastClr="FFFFFF"/>
+      </a:lt1>
+      <a:dk2>
+        <a:srgbClr val="44546A"/>
+      </a:dk2>
+      <a:lt2>
+        <a:srgbClr val="E7E6E6"/>
+      </a:lt2>
+      <a:accent1>
+        <a:srgbClr val="4472C4"/>
+      </a:accent1>
+      <a:accent2>
+        <a:srgbClr val="ED7D31"/>
+      </a:accent2>
+      <a:accent3>
+        <a:srgbClr val="A5A5A5"/>
+      </a:accent3>
+      <a:accent4>
+        <a:srgbClr val="FFC000"/>
+      </a:accent4>
+      <a:accent5>
+        <a:srgbClr val="5B9BD5"/>
+      </a:accent5>
+      <a:accent6>
+        <a:srgbClr val="70AD47"/>
+      </a:accent6>
+      <a:hlink>
+        <a:srgbClr val="0563C1"/>
+      </a:hlink>
+      <a:folHlink>
+        <a:srgbClr val="954F72"/>
+      </a:folHlink>
+    </a:clrScheme>
+    <a:fontScheme name="Office">
+      <a:majorFont>
+        <a:latin typeface="Calibri Light" panose="020F0302020204030204"/>
+        <a:ea typeface=""/>
+        <a:cs typeface=""/>
+        <a:font script="Jpan" typeface="游ゴシック Light"/>
+        <a:font script="Hang" typeface="맑은 고딕"/>
+        <a:font script="Hans" typeface="等线 Light"/>
+        <a:font script="Hant" typeface="新細明體"/>
+        <a:font script="Arab" typeface="Times New Roman"/>
+        <a:font script="Hebr" typeface="Times New Roman"/>
+        <a:font script="Thai" typeface="Angsana New"/>
+        <a:font script="Ethi" typeface="Nyala"/>
+        <a:font script="Beng" typeface="Vrinda"/>
+        <a:font script="Gujr" typeface="Shruti"/>
+        <a:font script="Khmr" typeface="MoolBoran"/>
+        <a:font script="Knda" typeface="Tunga"/>
+        <a:font script="Guru" typeface="Raavi"/>
+        <a:font script="Cans" typeface="Euphemia"/>
+        <a:font script="Cher" typeface="Plantagenet Cherokee"/>
+        <a:font script="Yiii" typeface="Microsoft Yi Baiti"/>
+        <a:font script="Tibt" typeface="Microsoft Himalaya"/>
+        <a:font script="Thaa" typeface="MV Boli"/>
+        <a:font script="Deva" typeface="Mangal"/>
+        <a:font script="Telu" typeface="Gautami"/>
+        <a:font script="Taml" typeface="Latha"/>
+        <a:font script="Syrc" typeface="Estrangelo Edessa"/>
+        <a:font script="Orya" typeface="Kalinga"/>
+        <a:font script="Mlym" typeface="Kartika"/>
+        <a:font script="Laoo" typeface="DokChampa"/>
+        <a:font script="Sinh" typeface="Iskoola Pota"/>
+        <a:font script="Mong" typeface="Mongolian Baiti"/>
+        <a:font script="Viet" typeface="Times New Roman"/>
+        <a:font script="Uigh" typeface="Microsoft Uighur"/>
+        <a:font script="Geor" typeface="Sylfaen"/>
+        <a:font script="Armn" typeface="Arial"/>
+        <a:font script="Bugi" typeface="Leelawadee UI"/>
+        <a:font script="Bopo" typeface="Microsoft JhengHei"/>
+        <a:font script="Java" typeface="Javanese Text"/>
+        <a:font script="Lisu" typeface="Segoe UI"/>
+        <a:font script="Mymr" typeface="Myanmar Text"/>
+        <a:font script="Nkoo" typeface="Ebrima"/>
+        <a:font script="Olck" typeface="Nirmala UI"/>
+        <a:font script="Osma" typeface="Ebrima"/>
+        <a:font script="Phag" typeface="Phagspa"/>
+        <a:font script="Syrn" typeface="Estrangelo Edessa"/>
+        <a:font script="Syrj" typeface="Estrangelo Edessa"/>
+        <a:font script="Syre" typeface="Estrangelo Edessa"/>
+        <a:font script="Sora" typeface="Nirmala UI"/>
+        <a:font script="Tale" typeface="Microsoft Tai Le"/>
+        <a:font script="Talu" typeface="Microsoft New Tai Lue"/>
+        <a:font script="Tfng" typeface="Ebrima"/>
+      </a:majorFont>
+      <a:minorFont>
+        <a:latin typeface="Calibri" panose="020F0502020204030204"/>
+        <a:ea typeface=""/>
+        <a:cs typeface=""/>
+        <a:font script="Jpan" typeface="游明朝"/>
+        <a:font script="Hang" typeface="맑은 고딕"/>
+        <a:font script="Hans" typeface="等线"/>
+        <a:font script="Hant" typeface="新細明體"/>
+        <a:font script="Arab" typeface="Arial"/>
+        <a:font script="Hebr" typeface="Arial"/>
+        <a:font script="Thai" typeface="Cordia New"/>
+        <a:font script="Ethi" typeface="Nyala"/>
+        <a:font script="Beng" typeface="Vrinda"/>
+        <a:font script="Gujr" typeface="Shruti"/>
+        <a:font script="Khmr" typeface="DaunPenh"/>
+        <a:font script="Knda" typeface="Tunga"/>
+        <a:font script="Guru" typeface="Raavi"/>
+        <a:font script="Cans" typeface="Euphemia"/>
+        <a:font script="Cher" typeface="Plantagenet Cherokee"/>
+        <a:font script="Yiii" typeface="Microsoft Yi Baiti"/>
+        <a:font script="Tibt" typeface="Microsoft Himalaya"/>
+        <a:font script="Thaa" typeface="MV Boli"/>
+        <a:font script="Deva" typeface="Mangal"/>
+        <a:font script="Telu" typeface="Gautami"/>
+        <a:font script="Taml" typeface="Latha"/>
+        <a:font script="Syrc" typeface="Estrangelo Edessa"/>
+        <a:font script="Orya" typeface="Kalinga"/>
+        <a:font script="Mlym" typeface="Kartika"/>
+        <a:font script="Laoo" typeface="DokChampa"/>
+        <a:font script="Sinh" typeface="Iskoola Pota"/>
+        <a:font script="Mong" typeface="Mongolian Baiti"/>
+        <a:font script="Viet" typeface="Arial"/>
+        <a:font script="Uigh" typeface="Microsoft Uighur"/>
+        <a:font script="Geor" typeface="Sylfaen"/>
+        <a:font script="Armn" typeface="Arial"/>
+        <a:font script="Bugi" typeface="Leelawadee UI"/>
+        <a:font script="Bopo" typeface="Microsoft JhengHei"/>
+        <a:font script="Java" typeface="Javanese Text"/>
+        <a:font script="Lisu" typeface="Segoe UI"/>
+        <a:font script="Mymr" typeface="Myanmar Text"/>
+        <a:font script="Nkoo" typeface="Ebrima"/>
+        <a:font script="Olck" typeface="Nirmala UI"/>
+        <a:font script="Osma" typeface="Ebrima"/>
+        <a:font script="Phag" typeface="Phagspa"/>
+        <a:font script="Syrn" typeface="Estrangelo Edessa"/>
+        <a:font script="Syrj" typeface="Estrangelo Edessa"/>
+        <a:font script="Syre" typeface="Estrangelo Edessa"/>
+        <a:font script="Sora" typeface="Nirmala UI"/>
+        <a:font script="Tale" typeface="Microsoft Tai Le"/>
+        <a:font script="Talu" typeface="Microsoft New Tai Lue"/>
+        <a:font script="Tfng" typeface="Ebrima"/>
+      </a:minorFont>
+    </a:fontScheme>
+    <a:fmtScheme name="Office">
+      <a:fillStyleLst>
+        <a:solidFill>
+          <a:schemeClr val="phClr"/>
+        </a:solidFill>
+        <a:gradFill rotWithShape="true">
+          <a:gsLst>
+            <a:gs pos="0">
+              <a:schemeClr val="phClr">
+                <a:lumMod val="110000"/>
+                <a:satMod val="105000"/>
+                <a:tint val="67000"/>
+              </a:schemeClr>
+            </a:gs>
+            <a:gs pos="50000">
+              <a:schemeClr val="phClr">
+                <a:lumMod val="105000"/>
+                <a:satMod val="103000"/>
+                <a:tint val="73000"/>
+              </a:schemeClr>
+            </a:gs>
+            <a:gs pos="100000">
+              <a:schemeClr val="phClr">
+                <a:lumMod val="105000"/>
+                <a:satMod val="109000"/>
+                <a:tint val="81000"/>
+              </a:schemeClr>
+            </a:gs>
+          </a:gsLst>
+          <a:lin ang="5400000" scaled="false"/>
+        </a:gradFill>
+        <a:gradFill rotWithShape="true">
+          <a:gsLst>
+            <a:gs pos="0">
+              <a:schemeClr val="phClr">
+                <a:satMod val="103000"/>
+                <a:lumMod val="102000"/>
+                <a:tint val="94000"/>
+              </a:schemeClr>
+            </a:gs>
+            <a:gs pos="50000">
+              <a:schemeClr val="phClr">
+                <a:satMod val="110000"/>
+                <a:lumMod val="100000"/>
+                <a:shade val="100000"/>
+              </a:schemeClr>
+            </a:gs>
+            <a:gs pos="100000">
+              <a:schemeClr val="phClr">
+                <a:lumMod val="99000"/>
+                <a:satMod val="120000"/>
+                <a:shade val="78000"/>
+              </a:schemeClr>
+            </a:gs>
+          </a:gsLst>
+          <a:lin ang="5400000" scaled="false"/>
+        </a:gradFill>
+      </a:fillStyleLst>
+      <a:lnStyleLst>
+        <a:ln w="6350" cap="flat" cmpd="sng" algn="ctr">
+          <a:solidFill>
+            <a:schemeClr val="phClr"/>
+          </a:solidFill>
+          <a:prstDash val="solid"/>
+          <a:miter lim="800000"/>
+        </a:ln>
+        <a:ln w="12700" cap="flat" cmpd="sng" algn="ctr">
+          <a:solidFill>
+            <a:schemeClr val="phClr"/>
+          </a:solidFill>
+          <a:prstDash val="solid"/>
+          <a:miter lim="800000"/>
+        </a:ln>
+        <a:ln w="19050" cap="flat" cmpd="sng" algn="ctr">
+          <a:solidFill>
+            <a:schemeClr val="phClr"/>
+          </a:solidFill>
+          <a:prstDash val="solid"/>
+          <a:miter lim="800000"/>
+        </a:ln>
+      </a:lnStyleLst>
+      <a:effectStyleLst>
+        <a:effectStyle>
+          <a:effectLst/>
+        </a:effectStyle>
+        <a:effectStyle>
+          <a:effectLst/>
+        </a:effectStyle>
+        <a:effectStyle>
+          <a:effectLst>
+            <a:outerShdw blurRad="57150" dist="19050" dir="5400000" algn="ctr" rotWithShape="false">
+              <a:srgbClr val="000000">
+                <a:alpha val="63000"/>
+              </a:srgbClr>
+            </a:outerShdw>
+          </a:effectLst>
+        </a:effectStyle>
+      </a:effectStyleLst>
+      <a:bgFillStyleLst>
+        <a:solidFill>
+          <a:schemeClr val="phClr"/>
+        </a:solidFill>
+        <a:solidFill>
+          <a:schemeClr val="phClr">
+            <a:tint val="95000"/>
+            <a:satMod val="170000"/>
+          </a:schemeClr>
+        </a:solidFill>
+        <a:gradFill rotWithShape="true">
+          <a:gsLst>
+            <a:gs pos="0">
+              <a:schemeClr val="phClr">
+                <a:tint val="93000"/>
+                <a:satMod val="150000"/>
+                <a:shade val="98000"/>
+                <a:lumMod val="102000"/>
+              </a:schemeClr>
+            </a:gs>
+            <a:gs pos="50000">
+              <a:schemeClr val="phClr">
+                <a:tint val="98000"/>
+                <a:satMod val="130000"/>
+                <a:shade val="90000"/>
+                <a:lumMod val="103000"/>
+              </a:schemeClr>
+            </a:gs>
+            <a:gs pos="100000">
+              <a:schemeClr val="phClr">
+                <a:shade val="63000"/>
+                <a:satMod val="120000"/>
+              </a:schemeClr>
+            </a:gs>
+          </a:gsLst>
+          <a:lin ang="5400000" scaled="false"/>
+        </a:gradFill>
+      </a:bgFillStyleLst>
+    </a:fmtScheme>
+  </a:themeElements>
+  <a:objectDefaults/>
+  <a:extraClrSchemeLst/>
+</a:theme>
 </file>
</xml_diff>

<commit_message>
fix(ressources): corrections de la relecture de la barre des cycles
- Classement : le superieur est teste avant le college (« Licence 3e annee »,
  « 4eme annee ingenieur » ne tombent plus en 3e / 4e) ; libelles de cycle reconnus
  (« Premier cycle », « 1er cycle secondaire » -> 1er cycle ; « Second cycle »,
  « 2nd cycle secondaire » -> 2nd cycle ; « … universitaire » reste au superieur)
- Un seul groupe pour tous les accordeons de niveau (cycles et « Autres niveaux »)
- La page ne saute plus quand l'ouverture d'un niveau referme un niveau situe
  au-dessus : le resume clique reste a sa place
- Changement de cycle depuis le bas de la page : le cycle choisi revient a l'ecran
  et son titre recoit le focus (lecteurs d'ecran) ; defilement non anime si
  l'utilisateur prefere reduire les animations
- Guides regeneres (guide admin : banque classee par cycle)

Co-Authored-By: Claude Opus 5.5 <noreply@anthropic.com>
</commit_message>
<xml_diff>
--- a/guides/Guide-Admin-EduWeb.docx
+++ b/guides/Guide-Admin-EduWeb.docx
@@ -109,7 +109,7 @@
           <w:sz w:val="16"/>
           <w:szCs w:val="16"/>
         </w:rPr>
-        <w:t xml:space="preserve">family.eduweb.ci · Version du 1 octobre 2026</w:t>
+        <w:t xml:space="preserve">family.eduweb.ci · Version du 10 octobre 2026</w:t>
       </w:r>
     </w:p>
     <w:p>
@@ -141,11 +141,361 @@
       </w:sdtPr>
       <w:sdtContent>
         <w:p>
+          <w:pPr>
+            <w:pStyle w:val="TOC1"/>
+            <w:tabs>
+              <w:tab w:val="right" w:pos="9026" w:leader="dot"/>
+            </w:tabs>
+          </w:pPr>
           <w:r>
             <w:fldChar w:fldCharType="begin" w:dirty="true"/>
             <w:instrText xml:space="preserve">TOC \h \o "1-1"</w:instrText>
             <w:fldChar w:fldCharType="separate"/>
           </w:r>
+          <w:hyperlink w:history="1" w:anchor="_Toc52">
+            <w:r>
+              <w:t xml:space="preserve">1.  Bien démarrer — à lire en premier</w:t>
+            </w:r>
+            <w:r>
+              <w:tab/>
+            </w:r>
+            <w:r>
+              <w:fldChar w:fldCharType="begin" w:dirty="true"/>
+              <w:instrText xml:space="preserve">PAGEREF _Toc52 \h</w:instrText>
+              <w:fldChar w:fldCharType="separate"/>
+              <w:fldChar w:fldCharType="end"/>
+            </w:r>
+          </w:hyperlink>
+        </w:p>
+        <w:p>
+          <w:pPr>
+            <w:pStyle w:val="TOC1"/>
+            <w:tabs>
+              <w:tab w:val="right" w:pos="9026" w:leader="dot"/>
+            </w:tabs>
+          </w:pPr>
+          <w:hyperlink w:history="1" w:anchor="_Toc53">
+            <w:r>
+              <w:t xml:space="preserve">2.  Connexion et tableau de bord</w:t>
+            </w:r>
+            <w:r>
+              <w:tab/>
+            </w:r>
+            <w:r>
+              <w:fldChar w:fldCharType="begin" w:dirty="true"/>
+              <w:instrText xml:space="preserve">PAGEREF _Toc53 \h</w:instrText>
+              <w:fldChar w:fldCharType="separate"/>
+              <w:fldChar w:fldCharType="end"/>
+            </w:r>
+          </w:hyperlink>
+        </w:p>
+        <w:p>
+          <w:pPr>
+            <w:pStyle w:val="TOC1"/>
+            <w:tabs>
+              <w:tab w:val="right" w:pos="9026" w:leader="dot"/>
+            </w:tabs>
+          </w:pPr>
+          <w:hyperlink w:history="1" w:anchor="_Toc54">
+            <w:r>
+              <w:t xml:space="preserve">3.  Langue de lecture</w:t>
+            </w:r>
+            <w:r>
+              <w:tab/>
+            </w:r>
+            <w:r>
+              <w:fldChar w:fldCharType="begin" w:dirty="true"/>
+              <w:instrText xml:space="preserve">PAGEREF _Toc54 \h</w:instrText>
+              <w:fldChar w:fldCharType="separate"/>
+              <w:fldChar w:fldCharType="end"/>
+            </w:r>
+          </w:hyperlink>
+        </w:p>
+        <w:p>
+          <w:pPr>
+            <w:pStyle w:val="TOC1"/>
+            <w:tabs>
+              <w:tab w:val="right" w:pos="9026" w:leader="dot"/>
+            </w:tabs>
+          </w:pPr>
+          <w:hyperlink w:history="1" w:anchor="_Toc55">
+            <w:r>
+              <w:t xml:space="preserve">4.  Besoin d'aide ?</w:t>
+            </w:r>
+            <w:r>
+              <w:tab/>
+            </w:r>
+            <w:r>
+              <w:fldChar w:fldCharType="begin" w:dirty="true"/>
+              <w:instrText xml:space="preserve">PAGEREF _Toc55 \h</w:instrText>
+              <w:fldChar w:fldCharType="separate"/>
+              <w:fldChar w:fldCharType="end"/>
+            </w:r>
+          </w:hyperlink>
+        </w:p>
+        <w:p>
+          <w:pPr>
+            <w:pStyle w:val="TOC1"/>
+            <w:tabs>
+              <w:tab w:val="right" w:pos="9026" w:leader="dot"/>
+            </w:tabs>
+          </w:pPr>
+          <w:hyperlink w:history="1" w:anchor="_Toc56">
+            <w:r>
+              <w:t xml:space="preserve">5.  Installer l'application sur votre appareil</w:t>
+            </w:r>
+            <w:r>
+              <w:tab/>
+            </w:r>
+            <w:r>
+              <w:fldChar w:fldCharType="begin" w:dirty="true"/>
+              <w:instrText xml:space="preserve">PAGEREF _Toc56 \h</w:instrText>
+              <w:fldChar w:fldCharType="separate"/>
+              <w:fldChar w:fldCharType="end"/>
+            </w:r>
+          </w:hyperlink>
+        </w:p>
+        <w:p>
+          <w:pPr>
+            <w:pStyle w:val="TOC1"/>
+            <w:tabs>
+              <w:tab w:val="right" w:pos="9026" w:leader="dot"/>
+            </w:tabs>
+          </w:pPr>
+          <w:hyperlink w:history="1" w:anchor="_Toc57">
+            <w:r>
+              <w:t xml:space="preserve">6.  Gestion des utilisateurs</w:t>
+            </w:r>
+            <w:r>
+              <w:tab/>
+            </w:r>
+            <w:r>
+              <w:fldChar w:fldCharType="begin" w:dirty="true"/>
+              <w:instrText xml:space="preserve">PAGEREF _Toc57 \h</w:instrText>
+              <w:fldChar w:fldCharType="separate"/>
+              <w:fldChar w:fldCharType="end"/>
+            </w:r>
+          </w:hyperlink>
+        </w:p>
+        <w:p>
+          <w:pPr>
+            <w:pStyle w:val="TOC1"/>
+            <w:tabs>
+              <w:tab w:val="right" w:pos="9026" w:leader="dot"/>
+            </w:tabs>
+          </w:pPr>
+          <w:hyperlink w:history="1" w:anchor="_Toc58">
+            <w:r>
+              <w:t xml:space="preserve">7.  Coachs : rechercher, consulter, modifier</w:t>
+            </w:r>
+            <w:r>
+              <w:tab/>
+            </w:r>
+            <w:r>
+              <w:fldChar w:fldCharType="begin" w:dirty="true"/>
+              <w:instrText xml:space="preserve">PAGEREF _Toc58 \h</w:instrText>
+              <w:fldChar w:fldCharType="separate"/>
+              <w:fldChar w:fldCharType="end"/>
+            </w:r>
+          </w:hyperlink>
+        </w:p>
+        <w:p>
+          <w:pPr>
+            <w:pStyle w:val="TOC1"/>
+            <w:tabs>
+              <w:tab w:val="right" w:pos="9026" w:leader="dot"/>
+            </w:tabs>
+          </w:pPr>
+          <w:hyperlink w:history="1" w:anchor="_Toc59">
+            <w:r>
+              <w:t xml:space="preserve">8.  Finances &amp; commissions</w:t>
+            </w:r>
+            <w:r>
+              <w:tab/>
+            </w:r>
+            <w:r>
+              <w:fldChar w:fldCharType="begin" w:dirty="true"/>
+              <w:instrText xml:space="preserve">PAGEREF _Toc59 \h</w:instrText>
+              <w:fldChar w:fldCharType="separate"/>
+              <w:fldChar w:fldCharType="end"/>
+            </w:r>
+          </w:hyperlink>
+        </w:p>
+        <w:p>
+          <w:pPr>
+            <w:pStyle w:val="TOC1"/>
+            <w:tabs>
+              <w:tab w:val="right" w:pos="9026" w:leader="dot"/>
+            </w:tabs>
+          </w:pPr>
+          <w:hyperlink w:history="1" w:anchor="_Toc60">
+            <w:r>
+              <w:t xml:space="preserve">9.  Messagerie</w:t>
+            </w:r>
+            <w:r>
+              <w:tab/>
+            </w:r>
+            <w:r>
+              <w:fldChar w:fldCharType="begin" w:dirty="true"/>
+              <w:instrText xml:space="preserve">PAGEREF _Toc60 \h</w:instrText>
+              <w:fldChar w:fldCharType="separate"/>
+              <w:fldChar w:fldCharType="end"/>
+            </w:r>
+          </w:hyperlink>
+        </w:p>
+        <w:p>
+          <w:pPr>
+            <w:pStyle w:val="TOC1"/>
+            <w:tabs>
+              <w:tab w:val="right" w:pos="9026" w:leader="dot"/>
+            </w:tabs>
+          </w:pPr>
+          <w:hyperlink w:history="1" w:anchor="_Toc61">
+            <w:r>
+              <w:t xml:space="preserve">10.  Votre compte</w:t>
+            </w:r>
+            <w:r>
+              <w:tab/>
+            </w:r>
+            <w:r>
+              <w:fldChar w:fldCharType="begin" w:dirty="true"/>
+              <w:instrText xml:space="preserve">PAGEREF _Toc61 \h</w:instrText>
+              <w:fldChar w:fldCharType="separate"/>
+              <w:fldChar w:fldCharType="end"/>
+            </w:r>
+          </w:hyperlink>
+        </w:p>
+        <w:p>
+          <w:pPr>
+            <w:pStyle w:val="TOC1"/>
+            <w:tabs>
+              <w:tab w:val="right" w:pos="9026" w:leader="dot"/>
+            </w:tabs>
+          </w:pPr>
+          <w:hyperlink w:history="1" w:anchor="_Toc62">
+            <w:r>
+              <w:t xml:space="preserve">11.  Formation : formules, paiements et accès</w:t>
+            </w:r>
+            <w:r>
+              <w:tab/>
+            </w:r>
+            <w:r>
+              <w:fldChar w:fldCharType="begin" w:dirty="true"/>
+              <w:instrText xml:space="preserve">PAGEREF _Toc62 \h</w:instrText>
+              <w:fldChar w:fldCharType="separate"/>
+              <w:fldChar w:fldCharType="end"/>
+            </w:r>
+          </w:hyperlink>
+        </w:p>
+        <w:p>
+          <w:pPr>
+            <w:pStyle w:val="TOC1"/>
+            <w:tabs>
+              <w:tab w:val="right" w:pos="9026" w:leader="dot"/>
+            </w:tabs>
+          </w:pPr>
+          <w:hyperlink w:history="1" w:anchor="_Toc63">
+            <w:r>
+              <w:t xml:space="preserve">12.  Codes promo &amp; liens promo</w:t>
+            </w:r>
+            <w:r>
+              <w:tab/>
+            </w:r>
+            <w:r>
+              <w:fldChar w:fldCharType="begin" w:dirty="true"/>
+              <w:instrText xml:space="preserve">PAGEREF _Toc63 \h</w:instrText>
+              <w:fldChar w:fldCharType="separate"/>
+              <w:fldChar w:fldCharType="end"/>
+            </w:r>
+          </w:hyperlink>
+        </w:p>
+        <w:p>
+          <w:pPr>
+            <w:pStyle w:val="TOC1"/>
+            <w:tabs>
+              <w:tab w:val="right" w:pos="9026" w:leader="dot"/>
+            </w:tabs>
+          </w:pPr>
+          <w:hyperlink w:history="1" w:anchor="_Toc64">
+            <w:r>
+              <w:t xml:space="preserve">13.  Finance &amp; parrainage : rétrocessions, versements, antifraude</w:t>
+            </w:r>
+            <w:r>
+              <w:tab/>
+            </w:r>
+            <w:r>
+              <w:fldChar w:fldCharType="begin" w:dirty="true"/>
+              <w:instrText xml:space="preserve">PAGEREF _Toc64 \h</w:instrText>
+              <w:fldChar w:fldCharType="separate"/>
+              <w:fldChar w:fldCharType="end"/>
+            </w:r>
+          </w:hyperlink>
+        </w:p>
+        <w:p>
+          <w:pPr>
+            <w:pStyle w:val="TOC1"/>
+            <w:tabs>
+              <w:tab w:val="right" w:pos="9026" w:leader="dot"/>
+            </w:tabs>
+          </w:pPr>
+          <w:hyperlink w:history="1" w:anchor="_Toc65">
+            <w:r>
+              <w:t xml:space="preserve">14.  Éditions : librairie en ligne, commandes et loterie</w:t>
+            </w:r>
+            <w:r>
+              <w:tab/>
+            </w:r>
+            <w:r>
+              <w:fldChar w:fldCharType="begin" w:dirty="true"/>
+              <w:instrText xml:space="preserve">PAGEREF _Toc65 \h</w:instrText>
+              <w:fldChar w:fldCharType="separate"/>
+              <w:fldChar w:fldCharType="end"/>
+            </w:r>
+          </w:hyperlink>
+        </w:p>
+        <w:p>
+          <w:pPr>
+            <w:pStyle w:val="TOC1"/>
+            <w:tabs>
+              <w:tab w:val="right" w:pos="9026" w:leader="dot"/>
+            </w:tabs>
+          </w:pPr>
+          <w:hyperlink w:history="1" w:anchor="_Toc66">
+            <w:r>
+              <w:t xml:space="preserve">15.  Banque de ressources didactiques &amp; dons</w:t>
+            </w:r>
+            <w:r>
+              <w:tab/>
+            </w:r>
+            <w:r>
+              <w:fldChar w:fldCharType="begin" w:dirty="true"/>
+              <w:instrText xml:space="preserve">PAGEREF _Toc66 \h</w:instrText>
+              <w:fldChar w:fldCharType="separate"/>
+              <w:fldChar w:fldCharType="end"/>
+            </w:r>
+          </w:hyperlink>
+        </w:p>
+        <w:p>
+          <w:pPr>
+            <w:pStyle w:val="TOC1"/>
+            <w:tabs>
+              <w:tab w:val="right" w:pos="9026" w:leader="dot"/>
+            </w:tabs>
+          </w:pPr>
+          <w:hyperlink w:history="1" w:anchor="_Toc67">
+            <w:r>
+              <w:t xml:space="preserve">16.  Compétitions (épreuves chronométrées)</w:t>
+            </w:r>
+            <w:r>
+              <w:tab/>
+            </w:r>
+            <w:r>
+              <w:fldChar w:fldCharType="begin" w:dirty="true"/>
+              <w:instrText xml:space="preserve">PAGEREF _Toc67 \h</w:instrText>
+              <w:fldChar w:fldCharType="separate"/>
+              <w:fldChar w:fldCharType="end"/>
+            </w:r>
+          </w:hyperlink>
         </w:p>
         <w:p>
           <w:r>
@@ -194,9 +544,11 @@
       <w:pPr>
         <w:pStyle w:val="Heading1"/>
       </w:pPr>
+      <w:bookmarkStart w:name="_Toc52" w:id="52"/>
       <w:r>
         <w:t xml:space="preserve">1.  Bien démarrer — à lire en premier</w:t>
       </w:r>
+      <w:bookmarkEnd w:id="52"/>
     </w:p>
     <w:p>
       <w:pPr>
@@ -600,9 +952,11 @@
       <w:pPr>
         <w:pStyle w:val="Heading1"/>
       </w:pPr>
+      <w:bookmarkStart w:name="_Toc53" w:id="53"/>
       <w:r>
         <w:t xml:space="preserve">2.  Connexion et tableau de bord</w:t>
       </w:r>
+      <w:bookmarkEnd w:id="53"/>
     </w:p>
     <w:p>
       <w:pPr>
@@ -654,9 +1008,11 @@
       <w:pPr>
         <w:pStyle w:val="Heading1"/>
       </w:pPr>
+      <w:bookmarkStart w:name="_Toc54" w:id="54"/>
       <w:r>
         <w:t xml:space="preserve">3.  Langue de lecture</w:t>
       </w:r>
+      <w:bookmarkEnd w:id="54"/>
     </w:p>
     <w:p>
       <w:pPr>
@@ -691,9 +1047,11 @@
       <w:pPr>
         <w:pStyle w:val="Heading1"/>
       </w:pPr>
+      <w:bookmarkStart w:name="_Toc55" w:id="55"/>
       <w:r>
         <w:t xml:space="preserve">4.  Besoin d'aide ?</w:t>
       </w:r>
+      <w:bookmarkEnd w:id="55"/>
     </w:p>
     <w:p>
       <w:pPr>
@@ -711,9 +1069,11 @@
       <w:pPr>
         <w:pStyle w:val="Heading1"/>
       </w:pPr>
+      <w:bookmarkStart w:name="_Toc56" w:id="56"/>
       <w:r>
         <w:t xml:space="preserve">5.  Installer l'application sur votre appareil</w:t>
       </w:r>
+      <w:bookmarkEnd w:id="56"/>
     </w:p>
     <w:p>
       <w:pPr>
@@ -980,9 +1340,11 @@
       <w:pPr>
         <w:pStyle w:val="Heading1"/>
       </w:pPr>
+      <w:bookmarkStart w:name="_Toc57" w:id="57"/>
       <w:r>
         <w:t xml:space="preserve">6.  Gestion des utilisateurs</w:t>
       </w:r>
+      <w:bookmarkEnd w:id="57"/>
     </w:p>
     <w:p>
       <w:pPr>
@@ -1084,9 +1446,11 @@
       <w:pPr>
         <w:pStyle w:val="Heading1"/>
       </w:pPr>
+      <w:bookmarkStart w:name="_Toc58" w:id="58"/>
       <w:r>
         <w:t xml:space="preserve">7.  Coachs : rechercher, consulter, modifier</w:t>
       </w:r>
+      <w:bookmarkEnd w:id="58"/>
     </w:p>
     <w:p>
       <w:pPr>
@@ -1247,9 +1611,11 @@
       <w:pPr>
         <w:pStyle w:val="Heading1"/>
       </w:pPr>
+      <w:bookmarkStart w:name="_Toc59" w:id="59"/>
       <w:r>
         <w:t xml:space="preserve">8.  Finances &amp; commissions</w:t>
       </w:r>
+      <w:bookmarkEnd w:id="59"/>
     </w:p>
     <w:p>
       <w:pPr>
@@ -1301,9 +1667,11 @@
       <w:pPr>
         <w:pStyle w:val="Heading1"/>
       </w:pPr>
+      <w:bookmarkStart w:name="_Toc60" w:id="60"/>
       <w:r>
         <w:t xml:space="preserve">9.  Messagerie</w:t>
       </w:r>
+      <w:bookmarkEnd w:id="60"/>
     </w:p>
     <w:p>
       <w:pPr>
@@ -1321,9 +1689,11 @@
       <w:pPr>
         <w:pStyle w:val="Heading1"/>
       </w:pPr>
+      <w:bookmarkStart w:name="_Toc61" w:id="61"/>
       <w:r>
         <w:t xml:space="preserve">10.  Votre compte</w:t>
       </w:r>
+      <w:bookmarkEnd w:id="61"/>
     </w:p>
     <w:p>
       <w:pPr>
@@ -1341,9 +1711,11 @@
       <w:pPr>
         <w:pStyle w:val="Heading1"/>
       </w:pPr>
+      <w:bookmarkStart w:name="_Toc62" w:id="62"/>
       <w:r>
         <w:t xml:space="preserve">11.  Formation : formules, paiements et accès</w:t>
       </w:r>
+      <w:bookmarkEnd w:id="62"/>
     </w:p>
     <w:p>
       <w:pPr>
@@ -1598,9 +1970,11 @@
       <w:pPr>
         <w:pStyle w:val="Heading1"/>
       </w:pPr>
+      <w:bookmarkStart w:name="_Toc63" w:id="63"/>
       <w:r>
         <w:t xml:space="preserve">12.  Codes promo &amp; liens promo</w:t>
       </w:r>
+      <w:bookmarkEnd w:id="63"/>
     </w:p>
     <w:p>
       <w:pPr>
@@ -1699,9 +2073,11 @@
       <w:pPr>
         <w:pStyle w:val="Heading1"/>
       </w:pPr>
+      <w:bookmarkStart w:name="_Toc64" w:id="64"/>
       <w:r>
         <w:t xml:space="preserve">13.  Finance &amp; parrainage : rétrocessions, versements, antifraude</w:t>
       </w:r>
+      <w:bookmarkEnd w:id="64"/>
     </w:p>
     <w:p>
       <w:pPr>
@@ -1896,9 +2272,11 @@
       <w:pPr>
         <w:pStyle w:val="Heading1"/>
       </w:pPr>
+      <w:bookmarkStart w:name="_Toc65" w:id="65"/>
       <w:r>
         <w:t xml:space="preserve">14.  Éditions : librairie en ligne, commandes et loterie</w:t>
       </w:r>
+      <w:bookmarkEnd w:id="65"/>
     </w:p>
     <w:p>
       <w:pPr>
@@ -2191,9 +2569,11 @@
       <w:pPr>
         <w:pStyle w:val="Heading1"/>
       </w:pPr>
+      <w:bookmarkStart w:name="_Toc66" w:id="66"/>
       <w:r>
         <w:t xml:space="preserve">15.  Banque de ressources didactiques &amp; dons</w:t>
       </w:r>
+      <w:bookmarkEnd w:id="66"/>
     </w:p>
     <w:p>
       <w:pPr>
@@ -2204,7 +2584,7 @@
           <w:sz w:val="22"/>
           <w:szCs w:val="22"/>
         </w:rPr>
-        <w:t xml:space="preserve">La page publique family.eduweb.ci/ressources offre des contenus gratuits classés par niveau. Vous la composez depuis « Ressources (admin) » (permission Éditions) ; les dons qui la soutiennent se vérifient dans « 💛 Dons » (permission Finances).</w:t>
+        <w:t xml:space="preserve">La page publique family.eduweb.ci/ressources offre des contenus gratuits classés par cycle (barre latérale : cycle primaire, 1er cycle secondaire, 2nd cycle secondaire, cycle supérieur) puis par niveau. Vous la composez depuis « Ressources (admin) » (permission Éditions) ; les dons qui la soutiennent se vérifient dans « 💛 Dons » (permission Finances).</w:t>
       </w:r>
     </w:p>
     <w:p>
@@ -2229,7 +2609,7 @@
           <w:sz w:val="22"/>
           <w:szCs w:val="22"/>
         </w:rPr>
-        <w:t xml:space="preserve">« Ajouter une ressource » : titre, NIVEAU (l'accordéon d'affichage — les niveaux sont automatiquement classés de la Sixième à la Terminale), DISCIPLINE (la tuile à l'intérieur du niveau : SVT, Physique-Chimie… — le champ propose les disciplines déjà utilisées), description, ordre.</w:t>
+        <w:t xml:space="preserve">« Ajouter une ressource » : titre, NIVEAU (l'accordéon d'affichage — chaque niveau est rangé automatiquement dans son cycle et classé dans l'ordre : CP1 → CM2, Sixième → Troisième, Seconde → Terminale, puis BTS, licence, master… ; un niveau non reconnu, comme « Tous niveaux », s'affiche sous « Autres niveaux »), DISCIPLINE (la tuile à l'intérieur du niveau : SVT, Physique-Chimie… — le champ propose les disciplines déjà utilisées), description, ordre.</w:t>
       </w:r>
     </w:p>
     <w:p>
@@ -2393,9 +2773,11 @@
       <w:pPr>
         <w:pStyle w:val="Heading1"/>
       </w:pPr>
+      <w:bookmarkStart w:name="_Toc67" w:id="67"/>
       <w:r>
         <w:t xml:space="preserve">16.  Compétitions (épreuves chronométrées)</w:t>
       </w:r>
+      <w:bookmarkEnd w:id="67"/>
     </w:p>
     <w:p>
       <w:pPr>
@@ -3143,6 +3525,21 @@
   <w:style w:type="paragraph" w:styleId="Normal" w:default="1">
     <w:name w:val="Normal"/>
     <w:qFormat/>
+  </w:style>
+  <w:style w:type="table" w:styleId="TableNormal" w:default="true">
+    <w:name w:val="Normal Table"/>
+    <w:uiPriority w:val="99"/>
+    <w:semiHidden/>
+    <w:unhideWhenUsed/>
+    <w:tblPr>
+      <w:tblInd w:type="dxa" w:w="0"/>
+      <w:tblCellMar>
+        <w:top w:type="dxa" w:w="0"/>
+        <w:left w:type="dxa" w:w="108"/>
+        <w:bottom w:type="dxa" w:w="0"/>
+        <w:right w:type="dxa" w:w="108"/>
+      </w:tblCellMar>
+    </w:tblPr>
   </w:style>
   <w:style w:type="paragraph" w:styleId="Title">
     <w:name w:val="Title"/>

</xml_diff>